<commit_message>
Made changes in emergency, calculator, hitory
</commit_message>
<xml_diff>
--- a/Documentation/Week_2_Weekly_Report_SilentHelp_Arun_Sagar_Rai(2336607).docx
+++ b/Documentation/Week_2_Weekly_Report_SilentHelp_Arun_Sagar_Rai(2336607).docx
@@ -5,6 +5,7 @@
     <w:p>
       <w:pPr>
         <w:spacing w:after="0" w:line="240" w:lineRule="auto"/>
+        <w:jc w:val="both"/>
       </w:pPr>
       <w:r>
         <w:rPr>
@@ -17,6 +18,7 @@
     <w:p>
       <w:pPr>
         <w:spacing w:after="0" w:line="240" w:lineRule="auto"/>
+        <w:jc w:val="both"/>
       </w:pPr>
       <w:r>
         <w:rPr>
@@ -29,6 +31,7 @@
     <w:p>
       <w:pPr>
         <w:spacing w:after="0" w:line="240" w:lineRule="auto"/>
+        <w:jc w:val="both"/>
       </w:pPr>
       <w:r>
         <w:rPr>
@@ -41,6 +44,7 @@
     <w:p>
       <w:pPr>
         <w:spacing w:after="0" w:line="240" w:lineRule="auto"/>
+        <w:jc w:val="both"/>
       </w:pPr>
       <w:r>
         <w:rPr>
@@ -53,6 +57,7 @@
     <w:p>
       <w:pPr>
         <w:spacing w:after="20"/>
+        <w:jc w:val="both"/>
       </w:pPr>
     </w:p>
     <w:tbl>
@@ -63,8 +68,8 @@
         <w:tblLook w:val="04A0" w:firstRow="1" w:lastRow="0" w:firstColumn="1" w:lastColumn="0" w:noHBand="0" w:noVBand="1"/>
       </w:tblPr>
       <w:tblGrid>
-        <w:gridCol w:w="4320"/>
-        <w:gridCol w:w="5760"/>
+        <w:gridCol w:w="2969"/>
+        <w:gridCol w:w="7111"/>
       </w:tblGrid>
       <w:tr>
         <w:trPr>
@@ -74,7 +79,7 @@
         </w:trPr>
         <w:tc>
           <w:tcPr>
-            <w:tcW w:w="4320" w:type="dxa"/>
+            <w:tcW w:w="2969" w:type="dxa"/>
             <w:tcBorders>
               <w:top w:val="single" w:sz="6" w:space="0" w:color="000000"/>
               <w:left w:val="single" w:sz="6" w:space="0" w:color="000000"/>
@@ -91,6 +96,7 @@
           <w:p>
             <w:pPr>
               <w:spacing w:after="0" w:line="240" w:lineRule="auto"/>
+              <w:jc w:val="both"/>
             </w:pPr>
             <w:r>
               <w:rPr>
@@ -102,7 +108,7 @@
         </w:tc>
         <w:tc>
           <w:tcPr>
-            <w:tcW w:w="5760" w:type="dxa"/>
+            <w:tcW w:w="7111" w:type="dxa"/>
             <w:tcBorders>
               <w:top w:val="single" w:sz="6" w:space="0" w:color="000000"/>
               <w:left w:val="single" w:sz="6" w:space="0" w:color="000000"/>
@@ -119,6 +125,7 @@
           <w:p>
             <w:pPr>
               <w:spacing w:after="0" w:line="240" w:lineRule="auto"/>
+              <w:jc w:val="both"/>
             </w:pPr>
             <w:r>
               <w:rPr>
@@ -155,6 +162,7 @@
           <w:p>
             <w:pPr>
               <w:spacing w:after="0" w:line="240" w:lineRule="auto"/>
+              <w:jc w:val="both"/>
             </w:pPr>
             <w:r>
               <w:rPr>
@@ -173,7 +181,7 @@
         </w:trPr>
         <w:tc>
           <w:tcPr>
-            <w:tcW w:w="4320" w:type="dxa"/>
+            <w:tcW w:w="2969" w:type="dxa"/>
             <w:tcBorders>
               <w:top w:val="single" w:sz="6" w:space="0" w:color="000000"/>
               <w:left w:val="single" w:sz="6" w:space="0" w:color="000000"/>
@@ -190,6 +198,7 @@
           <w:p>
             <w:pPr>
               <w:spacing w:after="0" w:line="240" w:lineRule="auto"/>
+              <w:jc w:val="both"/>
             </w:pPr>
             <w:r>
               <w:rPr>
@@ -201,7 +210,7 @@
         </w:tc>
         <w:tc>
           <w:tcPr>
-            <w:tcW w:w="5760" w:type="dxa"/>
+            <w:tcW w:w="7111" w:type="dxa"/>
             <w:tcBorders>
               <w:top w:val="single" w:sz="6" w:space="0" w:color="000000"/>
               <w:left w:val="single" w:sz="6" w:space="0" w:color="000000"/>
@@ -218,6 +227,7 @@
           <w:p>
             <w:pPr>
               <w:spacing w:after="0" w:line="240" w:lineRule="auto"/>
+              <w:jc w:val="both"/>
             </w:pPr>
             <w:r>
               <w:rPr>
@@ -236,7 +246,7 @@
         </w:trPr>
         <w:tc>
           <w:tcPr>
-            <w:tcW w:w="4320" w:type="dxa"/>
+            <w:tcW w:w="2969" w:type="dxa"/>
             <w:tcBorders>
               <w:top w:val="single" w:sz="6" w:space="0" w:color="000000"/>
               <w:left w:val="single" w:sz="6" w:space="0" w:color="000000"/>
@@ -253,6 +263,7 @@
           <w:p>
             <w:pPr>
               <w:spacing w:after="0" w:line="240" w:lineRule="auto"/>
+              <w:jc w:val="both"/>
             </w:pPr>
             <w:r>
               <w:rPr>
@@ -264,7 +275,7 @@
         </w:tc>
         <w:tc>
           <w:tcPr>
-            <w:tcW w:w="5760" w:type="dxa"/>
+            <w:tcW w:w="7111" w:type="dxa"/>
             <w:tcBorders>
               <w:top w:val="single" w:sz="6" w:space="0" w:color="000000"/>
               <w:left w:val="single" w:sz="6" w:space="0" w:color="000000"/>
@@ -282,6 +293,7 @@
             <w:pPr>
               <w:spacing w:after="40" w:line="240" w:lineRule="auto"/>
               <w:ind w:left="29" w:hanging="29"/>
+              <w:jc w:val="both"/>
               <w:rPr>
                 <w:sz w:val="22"/>
               </w:rPr>
@@ -297,6 +309,7 @@
             <w:pPr>
               <w:spacing w:after="40" w:line="240" w:lineRule="auto"/>
               <w:ind w:left="29" w:hanging="29"/>
+              <w:jc w:val="both"/>
               <w:rPr>
                 <w:sz w:val="22"/>
               </w:rPr>
@@ -312,6 +325,7 @@
             <w:pPr>
               <w:spacing w:after="40" w:line="240" w:lineRule="auto"/>
               <w:ind w:left="29" w:hanging="29"/>
+              <w:jc w:val="both"/>
               <w:rPr>
                 <w:sz w:val="22"/>
               </w:rPr>
@@ -327,6 +341,7 @@
             <w:pPr>
               <w:spacing w:after="40" w:line="240" w:lineRule="auto"/>
               <w:ind w:left="29" w:hanging="29"/>
+              <w:jc w:val="both"/>
               <w:rPr>
                 <w:sz w:val="22"/>
               </w:rPr>
@@ -342,6 +357,7 @@
             <w:pPr>
               <w:spacing w:after="40" w:line="240" w:lineRule="auto"/>
               <w:ind w:left="29" w:hanging="29"/>
+              <w:jc w:val="both"/>
               <w:rPr>
                 <w:sz w:val="22"/>
               </w:rPr>
@@ -357,6 +373,7 @@
             <w:pPr>
               <w:spacing w:after="40" w:line="240" w:lineRule="auto"/>
               <w:ind w:left="29" w:hanging="29"/>
+              <w:jc w:val="both"/>
               <w:rPr>
                 <w:sz w:val="22"/>
               </w:rPr>
@@ -391,6 +408,12 @@
               <w:rPr>
                 <w:sz w:val="22"/>
               </w:rPr>
+              <w:t xml:space="preserve"> in draw.io</w:t>
+            </w:r>
+            <w:r>
+              <w:rPr>
+                <w:sz w:val="22"/>
+              </w:rPr>
               <w:t>.</w:t>
             </w:r>
           </w:p>
@@ -399,12 +422,12 @@
       <w:tr>
         <w:trPr>
           <w:cantSplit/>
-          <w:trHeight w:val="2781"/>
+          <w:trHeight w:val="2397"/>
           <w:jc w:val="center"/>
         </w:trPr>
         <w:tc>
           <w:tcPr>
-            <w:tcW w:w="4320" w:type="dxa"/>
+            <w:tcW w:w="2969" w:type="dxa"/>
             <w:tcBorders>
               <w:top w:val="single" w:sz="6" w:space="0" w:color="000000"/>
               <w:left w:val="single" w:sz="6" w:space="0" w:color="000000"/>
@@ -421,6 +444,7 @@
           <w:p>
             <w:pPr>
               <w:spacing w:after="0" w:line="240" w:lineRule="auto"/>
+              <w:jc w:val="both"/>
             </w:pPr>
             <w:r>
               <w:rPr>
@@ -432,7 +456,7 @@
         </w:tc>
         <w:tc>
           <w:tcPr>
-            <w:tcW w:w="5760" w:type="dxa"/>
+            <w:tcW w:w="7111" w:type="dxa"/>
             <w:tcBorders>
               <w:top w:val="single" w:sz="6" w:space="0" w:color="000000"/>
               <w:left w:val="single" w:sz="6" w:space="0" w:color="000000"/>
@@ -449,6 +473,7 @@
           <w:p>
             <w:pPr>
               <w:spacing w:after="40" w:line="240" w:lineRule="auto"/>
+              <w:jc w:val="both"/>
               <w:rPr>
                 <w:sz w:val="22"/>
               </w:rPr>
@@ -463,6 +488,7 @@
           <w:p>
             <w:pPr>
               <w:spacing w:after="40" w:line="240" w:lineRule="auto"/>
+              <w:jc w:val="both"/>
               <w:rPr>
                 <w:sz w:val="22"/>
               </w:rPr>
@@ -477,6 +503,7 @@
           <w:p>
             <w:pPr>
               <w:spacing w:after="40" w:line="240" w:lineRule="auto"/>
+              <w:jc w:val="both"/>
               <w:rPr>
                 <w:sz w:val="22"/>
               </w:rPr>
@@ -491,6 +518,7 @@
           <w:p>
             <w:pPr>
               <w:spacing w:after="40" w:line="240" w:lineRule="auto"/>
+              <w:jc w:val="both"/>
               <w:rPr>
                 <w:sz w:val="22"/>
               </w:rPr>
@@ -505,6 +533,7 @@
           <w:p>
             <w:pPr>
               <w:spacing w:after="40" w:line="240" w:lineRule="auto"/>
+              <w:jc w:val="both"/>
               <w:rPr>
                 <w:sz w:val="22"/>
               </w:rPr>
@@ -521,12 +550,12 @@
       <w:tr>
         <w:trPr>
           <w:cantSplit/>
-          <w:trHeight w:val="4084"/>
+          <w:trHeight w:val="3255"/>
           <w:jc w:val="center"/>
         </w:trPr>
         <w:tc>
           <w:tcPr>
-            <w:tcW w:w="4320" w:type="dxa"/>
+            <w:tcW w:w="2969" w:type="dxa"/>
             <w:tcBorders>
               <w:top w:val="single" w:sz="6" w:space="0" w:color="000000"/>
               <w:left w:val="single" w:sz="6" w:space="0" w:color="000000"/>
@@ -543,6 +572,7 @@
           <w:p>
             <w:pPr>
               <w:spacing w:after="0" w:line="240" w:lineRule="auto"/>
+              <w:jc w:val="both"/>
             </w:pPr>
             <w:r>
               <w:rPr>
@@ -554,7 +584,7 @@
         </w:tc>
         <w:tc>
           <w:tcPr>
-            <w:tcW w:w="5760" w:type="dxa"/>
+            <w:tcW w:w="7111" w:type="dxa"/>
             <w:tcBorders>
               <w:top w:val="single" w:sz="6" w:space="0" w:color="000000"/>
               <w:left w:val="single" w:sz="6" w:space="0" w:color="000000"/>
@@ -571,6 +601,7 @@
           <w:p>
             <w:pPr>
               <w:spacing w:after="0" w:line="240" w:lineRule="auto"/>
+              <w:jc w:val="both"/>
             </w:pPr>
           </w:p>
         </w:tc>
@@ -579,6 +610,7 @@
     <w:p>
       <w:pPr>
         <w:spacing w:before="60" w:after="80" w:line="240" w:lineRule="auto"/>
+        <w:jc w:val="both"/>
         <w:rPr>
           <w:sz w:val="19"/>
         </w:rPr>
@@ -587,6 +619,25 @@
     <w:p>
       <w:pPr>
         <w:spacing w:before="60" w:after="80" w:line="240" w:lineRule="auto"/>
+        <w:jc w:val="both"/>
+        <w:rPr>
+          <w:sz w:val="19"/>
+        </w:rPr>
+      </w:pPr>
+    </w:p>
+    <w:p>
+      <w:pPr>
+        <w:spacing w:before="60" w:after="80" w:line="240" w:lineRule="auto"/>
+        <w:jc w:val="both"/>
+        <w:rPr>
+          <w:sz w:val="19"/>
+        </w:rPr>
+      </w:pPr>
+    </w:p>
+    <w:p>
+      <w:pPr>
+        <w:spacing w:before="60" w:after="80" w:line="240" w:lineRule="auto"/>
+        <w:jc w:val="both"/>
         <w:rPr>
           <w:sz w:val="19"/>
         </w:rPr>
@@ -601,11 +652,25 @@
     <w:p>
       <w:pPr>
         <w:spacing w:before="60" w:after="80" w:line="240" w:lineRule="auto"/>
+        <w:jc w:val="both"/>
+      </w:pPr>
+    </w:p>
+    <w:p>
+      <w:pPr>
+        <w:spacing w:before="60" w:after="80" w:line="240" w:lineRule="auto"/>
+        <w:jc w:val="both"/>
+      </w:pPr>
+    </w:p>
+    <w:p>
+      <w:pPr>
+        <w:spacing w:before="60" w:after="80" w:line="240" w:lineRule="auto"/>
+        <w:jc w:val="both"/>
       </w:pPr>
     </w:p>
     <w:p>
       <w:pPr>
         <w:spacing w:after="0" w:line="240" w:lineRule="auto"/>
+        <w:jc w:val="both"/>
       </w:pPr>
       <w:r>
         <w:rPr>

</xml_diff>